<commit_message>
feat: elevate SalahSync to Production/Real-World Systems tier
Moves SalahSync from Product Engineering into the Production / Real-World Systems tier with a full case-study block, at the user's explicit request. It's honestly framed as a personal, single-user daily-use tool rather than a coworker/client-facing system like the other four. Syncs scripts/generate_cvs.py and both CVs to match, updates CLAUDE.md's project categorization notes, and bumps the service worker cache to v54.

Co-Authored-By: Claude Sonnet 5 <noreply@anthropic.com>
Claude-Session: https://claude.ai/code/session_01AAJhULsJ3pFS1Fh5p8MW7D
</commit_message>
<xml_diff>
--- a/Samiul_Alam_Sumel_CV.docx
+++ b/Samiul_Alam_Sumel_CV.docx
@@ -907,20 +907,20 @@
     </w:p>
     <w:p>
       <w:pPr>
-        <w:spacing w:before="20" w:after="0" w:line="240" w:lineRule="auto"/>
+        <w:spacing w:before="80" w:after="20"/>
       </w:pPr>
       <w:r>
         <w:rPr>
           <w:b/>
           <w:color w:val="1E3A5F"/>
-          <w:sz w:val="18"/>
+          <w:sz w:val="20"/>
         </w:rPr>
-        <w:t>World Kitchen Atlas</w:t>
+        <w:t>SalahSync</w:t>
       </w:r>
       <w:r>
         <w:rPr>
           <w:color w:val="5A5A5A"/>
-          <w:sz w:val="16"/>
+          <w:sz w:val="17"/>
         </w:rPr>
         <w:t xml:space="preserve">   —   </w:t>
       </w:r>
@@ -930,7 +930,7 @@
             <w:rFonts w:ascii="Calibri" w:hAnsi="Calibri"/>
             <w:u w:val="single"/>
             <w:color w:val="B8862A"/>
-            <w:sz w:val="16.4"/>
+            <w:sz w:val="17.6"/>
           </w:rPr>
           <w:t>Live</w:t>
         </w:r>
@@ -938,7 +938,7 @@
       <w:r>
         <w:rPr>
           <w:color w:val="5A5A5A"/>
-          <w:sz w:val="16"/>
+          <w:sz w:val="17"/>
         </w:rPr>
         <w:t xml:space="preserve">  |  </w:t>
       </w:r>
@@ -948,7 +948,7 @@
             <w:rFonts w:ascii="Calibri" w:hAnsi="Calibri"/>
             <w:u w:val="single"/>
             <w:color w:val="B8862A"/>
-            <w:sz w:val="16.4"/>
+            <w:sz w:val="17.6"/>
           </w:rPr>
           <w:t>GitHub</w:t>
         </w:r>
@@ -961,11 +961,39 @@
       </w:pPr>
       <w:r>
         <w:rPr>
+          <w:i/>
+          <w:color w:val="5A5A5A"/>
+          <w:sz w:val="18"/>
+        </w:rPr>
+        <w:t>Problem: A static printed daily-routine sheet couldn't adapt when Fajr time or office hours shifted, and couldn't track whether a prayer was actually made in jamaah, alone, or missed.</w:t>
+      </w:r>
+    </w:p>
+    <w:p>
+      <w:pPr>
+        <w:spacing w:after="20" w:line="252" w:lineRule="auto"/>
+        <w:jc w:val="both"/>
+      </w:pPr>
+      <w:r>
+        <w:rPr>
           <w:i w:val="0"/>
           <w:color w:val="2A2A2A"/>
+          <w:sz w:val="18"/>
+        </w:rPr>
+        <w:t>Offline-first installable PWA: set Fajr time/location and office hours once, and the full day's schedule (Tahajjud through sleep) recalculates itself, with a prayer/amal tracker, streaks, and offline solar prayer-time calculation — no API dependency. Personal daily-use tool, bilingual Bangla/English UI.</w:t>
+      </w:r>
+    </w:p>
+    <w:p>
+      <w:pPr>
+        <w:spacing w:after="60" w:line="252" w:lineRule="auto"/>
+        <w:jc w:val="both"/>
+      </w:pPr>
+      <w:r>
+        <w:rPr>
+          <w:i/>
+          <w:color w:val="5A5A5A"/>
           <w:sz w:val="17"/>
         </w:rPr>
-        <w:t>Next.js static-export culinary encyclopedia on Cloudflare Pages, with a Cloudflare Worker proxying a private GitHub data repo, admin CRUD, and a Durable-Object-backed visit counter.</w:t>
+        <w:t>Tech: PWA, Offline-First, Vanilla JS, i18n</w:t>
       </w:r>
     </w:p>
     <w:p>
@@ -978,7 +1006,7 @@
           <w:color w:val="1E3A5F"/>
           <w:sz w:val="18"/>
         </w:rPr>
-        <w:t>Outreach Copilot</w:t>
+        <w:t>World Kitchen Atlas</w:t>
       </w:r>
       <w:r>
         <w:rPr>
@@ -1028,7 +1056,7 @@
           <w:color w:val="2A2A2A"/>
           <w:sz w:val="17"/>
         </w:rPr>
-        <w:t>Single-user AI-drafted cold-outreach tool — Cloudflare Pages + Workers API, D1-backed leads/analytics, Workers AI draft generation across email/LinkedIn/WhatsApp/cover letter; every send stays a manual, deliberate step.</w:t>
+        <w:t>Next.js static-export culinary encyclopedia on Cloudflare Pages, with a Cloudflare Worker proxying a private GitHub data repo, admin CRUD, and a Durable-Object-backed visit counter.</w:t>
       </w:r>
     </w:p>
     <w:p>
@@ -1041,7 +1069,7 @@
           <w:color w:val="1E3A5F"/>
           <w:sz w:val="18"/>
         </w:rPr>
-        <w:t>SalahSync</w:t>
+        <w:t>Outreach Copilot</w:t>
       </w:r>
       <w:r>
         <w:rPr>
@@ -1091,7 +1119,7 @@
           <w:color w:val="2A2A2A"/>
           <w:sz w:val="17"/>
         </w:rPr>
-        <w:t>Offline-first installable PWA that auto-generates a full daily prayer/routine schedule from Fajr time and office hours — offline solar prayer-time calculation, streak tracking, bilingual Bangla/English UI.</w:t>
+        <w:t>Single-user AI-drafted cold-outreach tool — Cloudflare Pages + Workers API, D1-backed leads/analytics, Workers AI draft generation across email/LinkedIn/WhatsApp/cover letter; every send stays a manual, deliberate step.</w:t>
       </w:r>
     </w:p>
     <w:p>

</xml_diff>

<commit_message>
feat(site): reposition as Product Engineer for Real-World Operations
Third deliberate identity reversal (explicit user instruction, two
confirmation rounds): replaces "AI Product Engineer — Port & Logistics
Domain" with "Product Engineer for Real-World Operations" across the
title tag, meta/OG/Twitter tags, JSON-LD, nav badge, hero, About,
career timeline, Contact section, footer, and both CVs.

AI-assisted development moves from the headline into a new hero
credibility strip (.h-cred) alongside the existing domain/stack line,
rather than being part of the primary title. Contact section's
"Primary Focus" now leads with Product Engineer. Regenerated both
CVs from the updated generate_cvs.py and bumped the service worker
cache to v57 so return visitors get the update.

Co-Authored-By: Claude Sonnet 5 <noreply@anthropic.com>
Claude-Session: https://claude.ai/code/session_016HhduZ6PBqf5uCaPKzyXhn
</commit_message>
<xml_diff>
--- a/Samiul_Alam_Sumel_CV.docx
+++ b/Samiul_Alam_Sumel_CV.docx
@@ -27,7 +27,7 @@
           <w:color w:val="B8862A"/>
           <w:sz w:val="23"/>
         </w:rPr>
-        <w:t>AI Product Engineer — Port &amp; Logistics Domain</w:t>
+        <w:t>Product Engineer for Real-World Operations</w:t>
       </w:r>
     </w:p>
     <w:p>
@@ -155,7 +155,7 @@
           <w:color w:val="2A2A2A"/>
           <w:sz w:val="18"/>
         </w:rPr>
-        <w:t>AI Product Engineer with 12+ years of hands-on experience in cargo billing, vessel/vehicle tracking, and port authority workflows at Mongla Port Authority. Works requirement-first — finds the manual step in a process, designs the system, and builds it with AI-assisted development, tested against real business rules before it ships. 3 self-built tools are in daily production use at the billing desk and Traffic Department. Skills backed by that shipped software and self-directed study (The Odin Project, Full Stack Open), not a bootcamp certificate. Builds frontend independently; backend/data work with AI-assisted development (Claude Code), going deeper through a self-authored engineering roadmap. Not a bootcamp graduate or senior engineer, but bringing 12+ years of professional discipline from a demanding operational job. Seeking a remote AI Product Engineer, Port Operations Technologist, Logistics Systems Engineer, or full-stack role, worldwide, with no time zone constraints.</w:t>
+        <w:t>Product Engineer for Real-World Operations — turns operational problems into practical software. 12+ years of hands-on experience in cargo billing, vessel/vehicle tracking, and port authority workflows at Mongla Port Authority. Works requirement-first — finds the manual step in a process, designs the system, and builds it with AI-assisted development, tested against real business rules before it ships. 3 self-built tools are in daily production use at the billing desk and Traffic Department. Skills backed by that shipped software and self-directed study (The Odin Project, Full Stack Open), not a bootcamp certificate. Builds frontend independently; backend/data work with AI-assisted development (Claude Code), going deeper through a self-authored engineering roadmap. Not a bootcamp graduate or senior engineer, but bringing 12+ years of professional discipline from a demanding operational job. Seeking a remote Product Engineer, Port Operations Technologist, Logistics Systems Engineer, or full-stack role, worldwide, with no time zone constraints.</w:t>
       </w:r>
     </w:p>
     <w:p>

</xml_diff>